<commit_message>
Ibdaa form v16: abstract in the past tense (portal rule), trimmed to 388 words for a safe margin under 400
Co-Authored-By: Claude Opus 5.5 <noreply@anthropic.com>
Claude-Session: https://claude.ai/code/session_011J2KrGUp2npQo9Tosx1KRc
</commit_message>
<xml_diff>
--- a/docs/qacrs/form_drafts/IBDAA_2027_FORM_ACRS_v16.docx
+++ b/docs/qacrs/form_drafts/IBDAA_2027_FORM_ACRS_v16.docx
@@ -2837,24 +2837,24 @@
                 <w:szCs w:val="22"/>
                 <w:rtl/>
               </w:rPr>
-              <w:t xml:space="preserve">يقدّم هذا البحث نظام </w:t>
-            </w:r>
-            <w:r>
-              <w:rPr>
-                <w:rFonts w:ascii="Arial" w:hAnsi="Arial" w:cs="Arial"/>
-                <w:sz w:val="22"/>
-                <w:szCs w:val="22"/>
-              </w:rPr>
-              <w:t xml:space="preserve">ACRS (Automated Compromise Response System)</w:t>
-            </w:r>
-            <w:r>
-              <w:rPr>
-                <w:rFonts w:ascii="Arial" w:hAnsi="Arial" w:cs="Arial"/>
-                <w:sz w:val="22"/>
-                <w:szCs w:val="22"/>
-                <w:rtl/>
-              </w:rPr>
-              <w:t xml:space="preserve">، الذي يصوغ قرار الاحتواء للشبكة كاملة كمسألة تحسين ثنائية (</w:t>
+              <w:t xml:space="preserve">بنينا في هذا البحث نظام </w:t>
+            </w:r>
+            <w:r>
+              <w:rPr>
+                <w:rFonts w:ascii="Arial" w:hAnsi="Arial" w:cs="Arial"/>
+                <w:sz w:val="22"/>
+                <w:szCs w:val="22"/>
+              </w:rPr>
+              <w:t xml:space="preserve">ACRS</w:t>
+            </w:r>
+            <w:r>
+              <w:rPr>
+                <w:rFonts w:ascii="Arial" w:hAnsi="Arial" w:cs="Arial"/>
+                <w:sz w:val="22"/>
+                <w:szCs w:val="22"/>
+                <w:rtl/>
+              </w:rPr>
+              <w:t xml:space="preserve">، وصغنا قرار الاحتواء للشبكة كاملة كمسألة تحسين ثنائية (</w:t>
             </w:r>
             <w:r>
               <w:rPr>
@@ -2871,7 +2871,7 @@
                 <w:szCs w:val="22"/>
                 <w:rtl/>
               </w:rPr>
-              <w:t xml:space="preserve"> تختار أقل إجراء يكفي لإيقاف الهجوم: عزل، أو تقييد، أو «تجزئة» للخادم الحرج تُبقي خدمته تعمل. ويمرّ كل قرار عبر بوابة سلامة مستقلة عن المُحسِّن تحيل القرارات الحرجة لموافقة شخصين بدل أن تفشل بصمت.</w:t>
+              <w:t xml:space="preserve"> اختارت أقل إجراء يكفي لإيقاف الهجوم: عزل، أو تقييد، أو «تجزئة» للخادم الحرج أبقت خدمته تعمل. ومرّ كل قرار عبر بوابة سلامة مستقلة عن المُحسِّن أحالت القرارات الحرجة لموافقة شخصين بدل أن تفشل بصمت.</w:t>
             </w:r>
           </w:p>
           <w:p>
@@ -3250,24 +3250,7 @@
                 <w:szCs w:val="22"/>
                 <w:rtl/>
               </w:rPr>
-              <w:t xml:space="preserve"> و</w:t>
-            </w:r>
-            <w:r>
-              <w:rPr>
-                <w:rFonts w:ascii="Arial" w:hAnsi="Arial" w:cs="Arial"/>
-                <w:sz w:val="22"/>
-                <w:szCs w:val="22"/>
-              </w:rPr>
-              <w:t xml:space="preserve">HSE: 16</w:t>
-            </w:r>
-            <w:r>
-              <w:rPr>
-                <w:rFonts w:ascii="Arial" w:hAnsi="Arial" w:cs="Arial"/>
-                <w:sz w:val="22"/>
-                <w:szCs w:val="22"/>
-                <w:rtl/>
-              </w:rPr>
-              <w:t xml:space="preserve"> لحظة اكتشاف، ثم </w:t>
+              <w:t xml:space="preserve">، ثم </w:t>
             </w:r>
             <w:r>
               <w:rPr>
@@ -3284,24 +3267,7 @@
                 <w:szCs w:val="22"/>
                 <w:rtl/>
               </w:rPr>
-              <w:t xml:space="preserve"> حادثة من مصادر مفتوحة </w:t>
-            </w:r>
-            <w:r>
-              <w:rPr>
-                <w:rFonts w:ascii="Arial" w:hAnsi="Arial" w:cs="Arial"/>
-                <w:sz w:val="22"/>
-                <w:szCs w:val="22"/>
-              </w:rPr>
-              <w:t xml:space="preserve">2013–2026)</w:t>
-            </w:r>
-            <w:r>
-              <w:rPr>
-                <w:rFonts w:ascii="Arial" w:hAnsi="Arial" w:cs="Arial"/>
-                <w:sz w:val="22"/>
-                <w:szCs w:val="22"/>
-                <w:rtl/>
-              </w:rPr>
-              <w:t xml:space="preserve"> فكشفت أن المُحسِّن وحده لا يتفوق على قاعدة بسيطة؛ وبعد إضافة «أرضية أمان» مسجّلة مسبقًا (</w:t>
+              <w:t xml:space="preserve"> حادثة من مصادر مفتوحة) فكشفت أن المُحسِّن وحده لا يتفوق على قاعدة بسيطة؛ وبعد إضافة «أرضية أمان» مسجّلة مسبقًا (</w:t>
             </w:r>
             <w:r>
               <w:rPr>
@@ -3612,7 +3578,7 @@
                 <w:szCs w:val="22"/>
                 <w:rtl/>
               </w:rPr>
-              <w:t xml:space="preserve"> مسألة على جهازين، وطابق القرار النهائي الحل الدقيق. ننشر الأهداف التي لم تتحقق من أول مرة وكيف عالجناها، ولا ندّعي تفوقًا كمّيًا. الشبكات الحقيقية مُعاد بناؤها جزئيًا من التقارير العامة، والنتائج تشير إلى أن الأنظمة يمكن أن تحتوي الهجوم دون أن توقف خدماتها متى وصل التنبيه.</w:t>
+              <w:t xml:space="preserve"> مسألة على جهازين، وطابق القرار النهائي الحل الدقيق. ونشرنا الأهداف التي لم تتحقق من أول مرة وكيف عالجناها، ولم ندّعِ تفوقًا كمّيًا. وكانت الشبكات الحقيقية مُعاد بناؤها جزئيًا من التقارير العامة، وأشارت النتائج إلى أن الأنظمة يمكن أن تحتوي الهجوم دون أن توقف خدماتها متى وصل التنبيه.</w:t>
             </w:r>
           </w:p>
         </w:tc>

</xml_diff>